<commit_message>
feat(model): migrate model story to Qwen3.5 (0.4-9b / lite 4B) with settings auto-migration
Base moves to qwen3.5:9b (tantular-office:0.4-9b alias) and qwen3.5:4b lite; installers build the Office profile locally from the official base with registry as explicit opt-in; Studio timeout 480s. loadSettings now migrates EXACT retired defaults (0.3-8b -> 0.4-9b, qwen3:8b -> qwen3.5:9b, qwen3:4b -> tantular-office:lite) so earlier installs do not silently stay on old models, while custom model choices are never touched. MODEL_PERFORMANCE .md/.pptx/.docx regenerated for the 9B story; workshop dist rebuilt.

Co-Authored-By: Claude Fable 5 <noreply@anthropic.com>
</commit_message>
<xml_diff>
--- a/tantular_office_addin/docs/MODEL_PERFORMANCE.docx
+++ b/tantular_office_addin/docs/MODEL_PERFORMANCE.docx
@@ -72,7 +72,7 @@
         <w:pStyle w:val="ListNumber"/>
       </w:pPr>
       <w:r>
-        <w:t>Each Buat Deck click sends one request to the local companion (Ollama) with a 5-minute budget (timeoutMs: 300_000 — see src/tantularClient.js:108).</w:t>
+        <w:t>Each Buat Deck click sends one request to the local companion (Ollama) with a 8-minute budget (timeoutMs: 480_000 — see src/tantularClient.js).</w:t>
       </w:r>
     </w:p>
     <w:p>
@@ -80,7 +80,7 @@
         <w:pStyle w:val="ListNumber"/>
       </w:pPr>
       <w:r>
-        <w:t>On an under-provisioned laptop the 8B model cannot finish generation inside that budget. The request is aborted and the pane shows: “Permintaan model lokal terlalu lama. Coba lagi setelah model selesai dimuat, atau pilih model yang lebih cepat.” (src/tantularClient.js:264)</w:t>
+        <w:t>On an under-provisioned laptop the 9B model cannot finish generation inside that budget. The request is aborted and the pane shows: “Permintaan model lokal terlalu lama. Coba lagi setelah model selesai dimuat, atau pilih model yang lebih cepat.” (src/tantularClient.js:264)</w:t>
       </w:r>
     </w:p>
     <w:p>
@@ -129,7 +129,7 @@
           <w:i w:val="0"/>
           <w:sz w:val="22"/>
         </w:rPr>
-        <w:t>The 8B model is roughly 5 GB of weights. If it does not fit in physical memory the OS swaps it to disk, and token generation drops from tens of tokens/second to a fraction of one.</w:t>
+        <w:t>The 9B model is roughly 6.6 GB of weights. If it does not fit in physical memory the OS swaps it to disk, and token generation drops from tens of tokens/second to a fraction of one.</w:t>
       </w:r>
     </w:p>
     <w:p>
@@ -182,7 +182,7 @@
                 <w:b/>
                 <w:sz w:val="20"/>
               </w:rPr>
-              <w:t>8B model verdict</w:t>
+              <w:t>9B model verdict</w:t>
             </w:r>
           </w:p>
         </w:tc>
@@ -216,7 +216,7 @@
                 <w:b w:val="0"/>
                 <w:sz w:val="20"/>
               </w:rPr>
-              <w:t>Full 8B experience, works as designed</w:t>
+              <w:t>Full 9B experience, works as designed</w:t>
             </w:r>
           </w:p>
         </w:tc>
@@ -318,7 +318,7 @@
                 <w:b w:val="0"/>
                 <w:sz w:val="20"/>
               </w:rPr>
-              <w:t>Effectively unusable with 8B</w:t>
+              <w:t>Effectively unusable with 9B</w:t>
             </w:r>
           </w:p>
         </w:tc>
@@ -350,7 +350,7 @@
         <w:pStyle w:val="ListNumber"/>
       </w:pPr>
       <w:r>
-        <w:t>In a terminal / PowerShell run:  ollama pull ghifidanukusumo/tantular:lite   (~2.5 GB, Qwen3-4B base with the Tantular Office profile — see ollama.com/ghifidanukusumo/Tantular).</w:t>
+        <w:t>In the workshop folder run:  TANTULAR_OFFICE_BASE_MODEL=qwen3.5:4b TANTULAR_OFFICE_MODEL_NAME=tantular-office:lite npm run model:office   (~3.4 GB, Qwen3.5-4B base).</w:t>
       </w:r>
     </w:p>
     <w:p>
@@ -358,7 +358,7 @@
         <w:pStyle w:val="ListNumber"/>
       </w:pPr>
       <w:r>
-        <w:t>In the Tantular pane → Pengaturan model lokal → set Model Studio: deck / DOCX / XLSX to ghifidanukusumo/tantular:lite → Simpan → Tes model terpilih. It should now respond in seconds.</w:t>
+        <w:t>In the Tantular pane → Pengaturan model lokal → set Model Studio: deck / DOCX / XLSX to tantular-office:lite → Simpan → Tes model terpilih. It should now respond in seconds.</w:t>
       </w:r>
     </w:p>
     <w:p>
@@ -389,7 +389,7 @@
           <w:i w:val="0"/>
           <w:sz w:val="22"/>
         </w:rPr>
-        <w:t>The model is published at ollama.com/ghifidanukusumo/Tantular, so both installers default to a straight ollama pull (no local Modelfile build). They detect installed RAM and pick the tag:</w:t>
+        <w:t>Both installers pull the official Qwen3.5 base from Ollama, apply the local Office profile, and select the base according to installed RAM:</w:t>
       </w:r>
     </w:p>
     <w:p>
@@ -416,7 +416,7 @@
           <w:i w:val="0"/>
           <w:sz w:val="22"/>
         </w:rPr>
-        <w:t>Below 12 GB they skip the 8B entirely and pull the light variant:</w:t>
+        <w:t>Below 12 GB they skip the 9B entirely and build the light variant:</w:t>
       </w:r>
     </w:p>
     <w:tbl>
@@ -426,15 +426,14 @@
         <w:tblLook w:firstColumn="1" w:firstRow="1" w:lastColumn="0" w:lastRow="0" w:noHBand="0" w:noVBand="1" w:val="04A0"/>
       </w:tblPr>
       <w:tblGrid>
-        <w:gridCol w:w="2340"/>
-        <w:gridCol w:w="2340"/>
-        <w:gridCol w:w="2340"/>
-        <w:gridCol w:w="2340"/>
+        <w:gridCol w:w="3120"/>
+        <w:gridCol w:w="3120"/>
+        <w:gridCol w:w="3120"/>
       </w:tblGrid>
       <w:tr>
         <w:tc>
           <w:tcPr>
-            <w:tcW w:type="dxa" w:w="2340"/>
+            <w:tcW w:type="dxa" w:w="3120"/>
           </w:tcPr>
           <w:p>
             <w:r/>
@@ -450,7 +449,7 @@
         </w:tc>
         <w:tc>
           <w:tcPr>
-            <w:tcW w:type="dxa" w:w="2340"/>
+            <w:tcW w:type="dxa" w:w="3120"/>
           </w:tcPr>
           <w:p>
             <w:r/>
@@ -460,29 +459,13 @@
                 <w:b/>
                 <w:sz w:val="20"/>
               </w:rPr>
-              <w:t>Tag pulled</w:t>
+              <w:t>Base pulled</w:t>
             </w:r>
           </w:p>
         </w:tc>
         <w:tc>
           <w:tcPr>
-            <w:tcW w:type="dxa" w:w="2340"/>
-          </w:tcPr>
-          <w:p>
-            <w:r/>
-            <w:r>
-              <w:rPr>
-                <w:rFonts w:ascii="Calibri" w:hAnsi="Calibri"/>
-                <w:b/>
-                <w:sz w:val="20"/>
-              </w:rPr>
-              <w:t>Base</w:t>
-            </w:r>
-          </w:p>
-        </w:tc>
-        <w:tc>
-          <w:tcPr>
-            <w:tcW w:type="dxa" w:w="2340"/>
+            <w:tcW w:type="dxa" w:w="3120"/>
           </w:tcPr>
           <w:p>
             <w:r/>
@@ -500,7 +483,7 @@
       <w:tr>
         <w:tc>
           <w:tcPr>
-            <w:tcW w:type="dxa" w:w="2340"/>
+            <w:tcW w:type="dxa" w:w="3120"/>
           </w:tcPr>
           <w:p>
             <w:r/>
@@ -516,7 +499,7 @@
         </w:tc>
         <w:tc>
           <w:tcPr>
-            <w:tcW w:type="dxa" w:w="2340"/>
+            <w:tcW w:type="dxa" w:w="3120"/>
           </w:tcPr>
           <w:p>
             <w:r/>
@@ -526,13 +509,13 @@
                 <w:b w:val="0"/>
                 <w:sz w:val="20"/>
               </w:rPr>
-              <w:t>ghifidanukusumo/tantular:latest</w:t>
+              <w:t>qwen3.5:9b</w:t>
             </w:r>
           </w:p>
         </w:tc>
         <w:tc>
           <w:tcPr>
-            <w:tcW w:type="dxa" w:w="2340"/>
+            <w:tcW w:type="dxa" w:w="3120"/>
           </w:tcPr>
           <w:p>
             <w:r/>
@@ -542,23 +525,7 @@
                 <w:b w:val="0"/>
                 <w:sz w:val="20"/>
               </w:rPr>
-              <w:t>qwen3:8b</w:t>
-            </w:r>
-          </w:p>
-        </w:tc>
-        <w:tc>
-          <w:tcPr>
-            <w:tcW w:type="dxa" w:w="2340"/>
-          </w:tcPr>
-          <w:p>
-            <w:r/>
-            <w:r>
-              <w:rPr>
-                <w:rFonts w:ascii="Calibri" w:hAnsi="Calibri"/>
-                <w:b w:val="0"/>
-                <w:sz w:val="20"/>
-              </w:rPr>
-              <w:t>tantular-office:0.3-8b</w:t>
+              <w:t>tantular-office:0.4-9b</w:t>
             </w:r>
           </w:p>
         </w:tc>
@@ -566,7 +533,7 @@
       <w:tr>
         <w:tc>
           <w:tcPr>
-            <w:tcW w:type="dxa" w:w="2340"/>
+            <w:tcW w:type="dxa" w:w="3120"/>
           </w:tcPr>
           <w:p>
             <w:r/>
@@ -582,7 +549,7 @@
         </w:tc>
         <w:tc>
           <w:tcPr>
-            <w:tcW w:type="dxa" w:w="2340"/>
+            <w:tcW w:type="dxa" w:w="3120"/>
           </w:tcPr>
           <w:p>
             <w:r/>
@@ -592,29 +559,13 @@
                 <w:b w:val="0"/>
                 <w:sz w:val="20"/>
               </w:rPr>
-              <w:t>ghifidanukusumo/tantular:lite</w:t>
+              <w:t>qwen3.5:4b</w:t>
             </w:r>
           </w:p>
         </w:tc>
         <w:tc>
           <w:tcPr>
-            <w:tcW w:type="dxa" w:w="2340"/>
-          </w:tcPr>
-          <w:p>
-            <w:r/>
-            <w:r>
-              <w:rPr>
-                <w:rFonts w:ascii="Calibri" w:hAnsi="Calibri"/>
-                <w:b w:val="0"/>
-                <w:sz w:val="20"/>
-              </w:rPr>
-              <w:t>qwen3:4b</w:t>
-            </w:r>
-          </w:p>
-        </w:tc>
-        <w:tc>
-          <w:tcPr>
-            <w:tcW w:type="dxa" w:w="2340"/>
+            <w:tcW w:type="dxa" w:w="3120"/>
           </w:tcPr>
           <w:p>
             <w:r/>
@@ -639,7 +590,7 @@
           <w:i w:val="0"/>
           <w:sz w:val="22"/>
         </w:rPr>
-        <w:t>The pulled model is aliased to the local name the add-in expects, so the Model Studio default keeps working unchanged. If the registry pull fails (offline venue), the installers fall back to the old local build. TANTULAR_OFFICE_BASE_MODEL / TANTULAR_OFFICE_REGISTRY_MODEL override auto-detection and the registry source.</w:t>
+        <w:t>The generated model uses the local alias the add-in expects. TANTULAR_OFFICE_BASE_MODEL overrides auto-detection; TANTULAR_OFFICE_REGISTRY_MODEL opts into a prebuilt registry source.</w:t>
       </w:r>
     </w:p>
     <w:p>
@@ -766,7 +717,7 @@
                 <w:b w:val="0"/>
                 <w:sz w:val="20"/>
               </w:rPr>
-              <w:t>300 s</w:t>
+              <w:t>480 s</w:t>
             </w:r>
           </w:p>
         </w:tc>
@@ -782,7 +733,7 @@
                 <w:b w:val="0"/>
                 <w:sz w:val="20"/>
               </w:rPr>
-              <w:t>Model Studio (8B / lite)</w:t>
+              <w:t>Model Studio (9B / lite)</w:t>
             </w:r>
           </w:p>
         </w:tc>
@@ -1001,7 +952,7 @@
                 <w:b/>
                 <w:sz w:val="20"/>
               </w:rPr>
-              <w:t>tantular-office (8B)</w:t>
+              <w:t>tantular-office (9B)</w:t>
             </w:r>
           </w:p>
         </w:tc>
@@ -1051,7 +1002,7 @@
                 <w:b w:val="0"/>
                 <w:sz w:val="20"/>
               </w:rPr>
-              <w:t>~5 GB</w:t>
+              <w:t>~6.6 GB</w:t>
             </w:r>
           </w:p>
         </w:tc>
@@ -1067,7 +1018,7 @@
                 <w:b w:val="0"/>
                 <w:sz w:val="20"/>
               </w:rPr>
-              <w:t>~2.5 GB</w:t>
+              <w:t>~3.4 GB</w:t>
             </w:r>
           </w:p>
         </w:tc>
@@ -1235,7 +1186,7 @@
                 <w:b w:val="0"/>
                 <w:sz w:val="20"/>
               </w:rPr>
-              <w:t>Risk of 5-minute timeouts</w:t>
+              <w:t>Risk of Studio timeouts</w:t>
             </w:r>
           </w:p>
         </w:tc>
@@ -1282,7 +1233,7 @@
           <w:i w:val="0"/>
           <w:sz w:val="22"/>
         </w:rPr>
-        <w:t>Deck quality on 4B is a step below 8B but still produces properly structured decks — vastly better than timeouts and fallbacks.</w:t>
+        <w:t>Deck quality on 4B is a step below 9B but still produces properly structured decks — vastly better than timeouts and fallbacks.</w:t>
       </w:r>
     </w:p>
     <w:p>
@@ -1313,7 +1264,7 @@
         <w:pStyle w:val="IntenseQuote"/>
       </w:pPr>
       <w:r>
-        <w:t>16 GB RAM → full 8B experience. 8 GB RAM → lite model, still works. Below 12 GB the installer automatically switches to tantular-office:lite.</w:t>
+        <w:t>16 GB RAM → full 9B experience. 8 GB RAM → lite model, still works. Below 12 GB the installer automatically switches to tantular-office:lite.</w:t>
       </w:r>
     </w:p>
     <w:p>

</xml_diff>